<commit_message>
Assessment moderator comments incorporated
</commit_message>
<xml_diff>
--- a/Assessment/ECS8052 Assessment 1 Moderator Form.docx
+++ b/Assessment/ECS8052 Assessment 1 Moderator Form.docx
@@ -580,7 +580,11 @@
           <w:tcPr>
             <w:tcW w:w="5670" w:type="dxa"/>
           </w:tcPr>
-          <w:p/>
+          <w:p>
+            <w:r>
+              <w:t xml:space="preserve">Assessment 1 is well-designed to assess students’ learning output. Detailed instructions for preparing and submitting the assessment are provided. A clear marking scheme is also included for students’ reference. </w:t>
+            </w:r>
+          </w:p>
         </w:tc>
       </w:tr>
       <w:tr>
@@ -598,7 +602,61 @@
           <w:tcPr>
             <w:tcW w:w="5670" w:type="dxa"/>
           </w:tcPr>
-          <w:p/>
+          <w:p>
+            <w:r>
+              <w:rPr>
+                <w:noProof/>
+              </w:rPr>
+              <w:drawing>
+                <wp:inline distT="0" distB="0" distL="0" distR="0" wp14:anchorId="34FED9CA" wp14:editId="42CC21DD">
+                  <wp:extent cx="838200" cy="396240"/>
+                  <wp:effectExtent l="0" t="0" r="0" b="3810"/>
+                  <wp:docPr id="1602562280" name="Picture 1"/>
+                  <wp:cNvGraphicFramePr>
+                    <a:graphicFrameLocks xmlns:a="http://schemas.openxmlformats.org/drawingml/2006/main" noChangeAspect="1"/>
+                  </wp:cNvGraphicFramePr>
+                  <a:graphic xmlns:a="http://schemas.openxmlformats.org/drawingml/2006/main">
+                    <a:graphicData uri="http://schemas.openxmlformats.org/drawingml/2006/picture">
+                      <pic:pic xmlns:pic="http://schemas.openxmlformats.org/drawingml/2006/picture">
+                        <pic:nvPicPr>
+                          <pic:cNvPr id="1602562280" name="Picture 1"/>
+                          <pic:cNvPicPr>
+                            <a:picLocks noChangeAspect="1"/>
+                          </pic:cNvPicPr>
+                        </pic:nvPicPr>
+                        <pic:blipFill>
+                          <a:blip r:embed="rId6" cstate="print">
+                            <a:extLst>
+                              <a:ext uri="{28A0092B-C50C-407E-A947-70E740481C1C}">
+                                <a14:useLocalDpi xmlns:a14="http://schemas.microsoft.com/office/drawing/2010/main" val="0"/>
+                              </a:ext>
+                            </a:extLst>
+                          </a:blip>
+                          <a:srcRect/>
+                          <a:stretch>
+                            <a:fillRect/>
+                          </a:stretch>
+                        </pic:blipFill>
+                        <pic:spPr bwMode="auto">
+                          <a:xfrm>
+                            <a:off x="0" y="0"/>
+                            <a:ext cx="838200" cy="396240"/>
+                          </a:xfrm>
+                          <a:prstGeom prst="rect">
+                            <a:avLst/>
+                          </a:prstGeom>
+                          <a:noFill/>
+                          <a:ln>
+                            <a:noFill/>
+                          </a:ln>
+                        </pic:spPr>
+                      </pic:pic>
+                    </a:graphicData>
+                  </a:graphic>
+                </wp:inline>
+              </w:drawing>
+            </w:r>
+          </w:p>
         </w:tc>
       </w:tr>
     </w:tbl>
@@ -727,7 +785,6 @@
                 <w:bCs/>
               </w:rPr>
             </w:pPr>
-            <w:commentRangeStart w:id="0"/>
             <w:r>
               <w:rPr>
                 <w:b/>
@@ -741,13 +798,6 @@
                 <w:bCs/>
               </w:rPr>
               <w:t xml:space="preserve"> </w:t>
-            </w:r>
-            <w:commentRangeEnd w:id="0"/>
-            <w:r>
-              <w:rPr>
-                <w:rStyle w:val="CommentReference"/>
-              </w:rPr>
-              <w:commentReference w:id="0"/>
             </w:r>
           </w:p>
         </w:tc>
@@ -926,7 +976,6 @@
             <w:tcW w:w="3539" w:type="dxa"/>
           </w:tcPr>
           <w:p>
-            <w:commentRangeStart w:id="1"/>
             <w:r>
               <w:t xml:space="preserve">Marking </w:t>
             </w:r>
@@ -935,13 +984,6 @@
             </w:r>
             <w:r>
               <w:t>Moderated By:</w:t>
-            </w:r>
-            <w:commentRangeEnd w:id="1"/>
-            <w:r>
-              <w:rPr>
-                <w:rStyle w:val="CommentReference"/>
-              </w:rPr>
-              <w:commentReference w:id="1"/>
             </w:r>
           </w:p>
         </w:tc>
@@ -1093,7 +1135,7 @@
                 <w:bCs/>
               </w:rPr>
             </w:pPr>
-            <w:commentRangeStart w:id="2"/>
+            <w:commentRangeStart w:id="0"/>
             <w:r>
               <w:rPr>
                 <w:b/>
@@ -1101,12 +1143,12 @@
               </w:rPr>
               <w:t xml:space="preserve">Integrity of Assessment </w:t>
             </w:r>
-            <w:commentRangeEnd w:id="2"/>
+            <w:commentRangeEnd w:id="0"/>
             <w:r>
               <w:rPr>
                 <w:rStyle w:val="CommentReference"/>
               </w:rPr>
-              <w:commentReference w:id="2"/>
+              <w:commentReference w:id="0"/>
             </w:r>
           </w:p>
         </w:tc>
@@ -1337,7 +1379,7 @@
     </w:tbl>
     <w:p/>
     <w:sectPr>
-      <w:headerReference w:type="default" r:id="rId10"/>
+      <w:headerReference w:type="default" r:id="rId11"/>
       <w:pgSz w:w="11906" w:h="16838"/>
       <w:pgMar w:top="1440" w:right="1440" w:bottom="1440" w:left="1440" w:header="708" w:footer="708" w:gutter="0"/>
       <w:cols w:space="708"/>
@@ -1349,39 +1391,7 @@
 
 <file path=word/comments.xml><?xml version="1.0" encoding="utf-8"?>
 <w:comments xmlns:wpc="http://schemas.microsoft.com/office/word/2010/wordprocessingCanvas" xmlns:cx="http://schemas.microsoft.com/office/drawing/2014/chartex" xmlns:cx1="http://schemas.microsoft.com/office/drawing/2015/9/8/chartex" xmlns:cx2="http://schemas.microsoft.com/office/drawing/2015/10/21/chartex" xmlns:cx3="http://schemas.microsoft.com/office/drawing/2016/5/9/chartex" xmlns:cx4="http://schemas.microsoft.com/office/drawing/2016/5/10/chartex" xmlns:cx5="http://schemas.microsoft.com/office/drawing/2016/5/11/chartex" xmlns:cx6="http://schemas.microsoft.com/office/drawing/2016/5/12/chartex" xmlns:cx7="http://schemas.microsoft.com/office/drawing/2016/5/13/chartex" xmlns:cx8="http://schemas.microsoft.com/office/drawing/2016/5/14/chartex" xmlns:mc="http://schemas.openxmlformats.org/markup-compatibility/2006" xmlns:aink="http://schemas.microsoft.com/office/drawing/2016/ink" xmlns:am3d="http://schemas.microsoft.com/office/drawing/2017/model3d" xmlns:o="urn:schemas-microsoft-com:office:office" xmlns:oel="http://schemas.microsoft.com/office/2019/extlst" xmlns:r="http://schemas.openxmlformats.org/officeDocument/2006/relationships" xmlns:m="http://schemas.openxmlformats.org/officeDocument/2006/math" xmlns:v="urn:schemas-microsoft-com:vml" xmlns:wp14="http://schemas.microsoft.com/office/word/2010/wordprocessingDrawing" xmlns:wp="http://schemas.openxmlformats.org/drawingml/2006/wordprocessingDrawing" xmlns:w10="urn:schemas-microsoft-com:office:word" xmlns:w="http://schemas.openxmlformats.org/wordprocessingml/2006/main" xmlns:w14="http://schemas.microsoft.com/office/word/2010/wordml" xmlns:w15="http://schemas.microsoft.com/office/word/2012/wordml" xmlns:w16cex="http://schemas.microsoft.com/office/word/2018/wordml/cex" xmlns:w16cid="http://schemas.microsoft.com/office/word/2016/wordml/cid" xmlns:w16="http://schemas.microsoft.com/office/word/2018/wordml" xmlns:w16du="http://schemas.microsoft.com/office/word/2023/wordml/word16du" xmlns:w16sdtdh="http://schemas.microsoft.com/office/word/2020/wordml/sdtdatahash" xmlns:w16sdtfl="http://schemas.microsoft.com/office/word/2024/wordml/sdtformatlock" xmlns:w16se="http://schemas.microsoft.com/office/word/2015/wordml/symex" xmlns:wpg="http://schemas.microsoft.com/office/word/2010/wordprocessingGroup" xmlns:wpi="http://schemas.microsoft.com/office/word/2010/wordprocessingInk" xmlns:wne="http://schemas.microsoft.com/office/word/2006/wordml" xmlns:wps="http://schemas.microsoft.com/office/word/2010/wordprocessingShape" mc:Ignorable="w14 w15 w16se w16cid w16 w16cex w16sdtdh w16sdtfl w16du wp14">
-  <w:comment w:id="0" w:author="Niall McLaughlin" w:date="2024-01-19T09:03:00Z" w:initials="NM">
-    <w:p>
-      <w:pPr>
-        <w:pStyle w:val="CommentText"/>
-      </w:pPr>
-      <w:r>
-        <w:rPr>
-          <w:rStyle w:val="CommentReference"/>
-        </w:rPr>
-        <w:annotationRef/>
-      </w:r>
-      <w:r>
-        <w:t>Module Owner to complete</w:t>
-      </w:r>
-    </w:p>
-  </w:comment>
-  <w:comment w:id="1" w:author="Niall McLaughlin" w:date="2024-01-19T09:04:00Z" w:initials="NM">
-    <w:p>
-      <w:pPr>
-        <w:pStyle w:val="CommentText"/>
-      </w:pPr>
-      <w:r>
-        <w:rPr>
-          <w:rStyle w:val="CommentReference"/>
-        </w:rPr>
-        <w:annotationRef/>
-      </w:r>
-      <w:r>
-        <w:t>Moderator to complete</w:t>
-      </w:r>
-    </w:p>
-  </w:comment>
-  <w:comment w:id="2" w:author="Niall McLaughlin" w:date="2024-01-19T09:04:00Z" w:initials="NM">
+  <w:comment w:id="0" w:author="Niall McLaughlin" w:date="2024-01-19T09:04:00Z" w:initials="NM">
     <w:p>
       <w:pPr>
         <w:pStyle w:val="CommentText"/>
@@ -1402,24 +1412,18 @@
 
 <file path=word/commentsExtended.xml><?xml version="1.0" encoding="utf-8"?>
 <w15:commentsEx xmlns:wpc="http://schemas.microsoft.com/office/word/2010/wordprocessingCanvas" xmlns:cx="http://schemas.microsoft.com/office/drawing/2014/chartex" xmlns:cx1="http://schemas.microsoft.com/office/drawing/2015/9/8/chartex" xmlns:cx2="http://schemas.microsoft.com/office/drawing/2015/10/21/chartex" xmlns:cx3="http://schemas.microsoft.com/office/drawing/2016/5/9/chartex" xmlns:cx4="http://schemas.microsoft.com/office/drawing/2016/5/10/chartex" xmlns:cx5="http://schemas.microsoft.com/office/drawing/2016/5/11/chartex" xmlns:cx6="http://schemas.microsoft.com/office/drawing/2016/5/12/chartex" xmlns:cx7="http://schemas.microsoft.com/office/drawing/2016/5/13/chartex" xmlns:cx8="http://schemas.microsoft.com/office/drawing/2016/5/14/chartex" xmlns:mc="http://schemas.openxmlformats.org/markup-compatibility/2006" xmlns:aink="http://schemas.microsoft.com/office/drawing/2016/ink" xmlns:am3d="http://schemas.microsoft.com/office/drawing/2017/model3d" xmlns:o="urn:schemas-microsoft-com:office:office" xmlns:oel="http://schemas.microsoft.com/office/2019/extlst" xmlns:r="http://schemas.openxmlformats.org/officeDocument/2006/relationships" xmlns:m="http://schemas.openxmlformats.org/officeDocument/2006/math" xmlns:v="urn:schemas-microsoft-com:vml" xmlns:wp14="http://schemas.microsoft.com/office/word/2010/wordprocessingDrawing" xmlns:wp="http://schemas.openxmlformats.org/drawingml/2006/wordprocessingDrawing" xmlns:w10="urn:schemas-microsoft-com:office:word" xmlns:w="http://schemas.openxmlformats.org/wordprocessingml/2006/main" xmlns:w14="http://schemas.microsoft.com/office/word/2010/wordml" xmlns:w15="http://schemas.microsoft.com/office/word/2012/wordml" xmlns:w16cex="http://schemas.microsoft.com/office/word/2018/wordml/cex" xmlns:w16cid="http://schemas.microsoft.com/office/word/2016/wordml/cid" xmlns:w16="http://schemas.microsoft.com/office/word/2018/wordml" xmlns:w16du="http://schemas.microsoft.com/office/word/2023/wordml/word16du" xmlns:w16sdtdh="http://schemas.microsoft.com/office/word/2020/wordml/sdtdatahash" xmlns:w16sdtfl="http://schemas.microsoft.com/office/word/2024/wordml/sdtformatlock" xmlns:w16se="http://schemas.microsoft.com/office/word/2015/wordml/symex" xmlns:wpg="http://schemas.microsoft.com/office/word/2010/wordprocessingGroup" xmlns:wpi="http://schemas.microsoft.com/office/word/2010/wordprocessingInk" xmlns:wne="http://schemas.microsoft.com/office/word/2006/wordml" xmlns:wps="http://schemas.microsoft.com/office/word/2010/wordprocessingShape" mc:Ignorable="w14 w15 w16se w16cid w16 w16cex w16sdtdh w16sdtfl w16du wp14">
-  <w15:commentEx w15:paraId="4AA60EC5" w15:done="0"/>
-  <w15:commentEx w15:paraId="281A3A95" w15:done="0"/>
   <w15:commentEx w15:paraId="140B60EE" w15:done="0"/>
 </w15:commentsEx>
 </file>
 
 <file path=word/commentsExtensible.xml><?xml version="1.0" encoding="utf-8"?>
 <w16cex:commentsExtensible xmlns:wpc="http://schemas.microsoft.com/office/word/2010/wordprocessingCanvas" xmlns:cx="http://schemas.microsoft.com/office/drawing/2014/chartex" xmlns:cx1="http://schemas.microsoft.com/office/drawing/2015/9/8/chartex" xmlns:cx2="http://schemas.microsoft.com/office/drawing/2015/10/21/chartex" xmlns:cx3="http://schemas.microsoft.com/office/drawing/2016/5/9/chartex" xmlns:cx4="http://schemas.microsoft.com/office/drawing/2016/5/10/chartex" xmlns:cx5="http://schemas.microsoft.com/office/drawing/2016/5/11/chartex" xmlns:cx6="http://schemas.microsoft.com/office/drawing/2016/5/12/chartex" xmlns:cx7="http://schemas.microsoft.com/office/drawing/2016/5/13/chartex" xmlns:cx8="http://schemas.microsoft.com/office/drawing/2016/5/14/chartex" xmlns:cr="http://schemas.microsoft.com/office/comments/2020/reactions" xmlns:mc="http://schemas.openxmlformats.org/markup-compatibility/2006" xmlns:aink="http://schemas.microsoft.com/office/drawing/2016/ink" xmlns:am3d="http://schemas.microsoft.com/office/drawing/2017/model3d" xmlns:o="urn:schemas-microsoft-com:office:office" xmlns:oel="http://schemas.microsoft.com/office/2019/extlst" xmlns:r="http://schemas.openxmlformats.org/officeDocument/2006/relationships" xmlns:m="http://schemas.openxmlformats.org/officeDocument/2006/math" xmlns:v="urn:schemas-microsoft-com:vml" xmlns:wp14="http://schemas.microsoft.com/office/word/2010/wordprocessingDrawing" xmlns:wp="http://schemas.openxmlformats.org/drawingml/2006/wordprocessingDrawing" xmlns:w10="urn:schemas-microsoft-com:office:word" xmlns:w="http://schemas.openxmlformats.org/wordprocessingml/2006/main" xmlns:w14="http://schemas.microsoft.com/office/word/2010/wordml" xmlns:w15="http://schemas.microsoft.com/office/word/2012/wordml" xmlns:w16cex="http://schemas.microsoft.com/office/word/2018/wordml/cex" xmlns:w16cid="http://schemas.microsoft.com/office/word/2016/wordml/cid" xmlns:w16="http://schemas.microsoft.com/office/word/2018/wordml" xmlns:w16du="http://schemas.microsoft.com/office/word/2023/wordml/word16du" xmlns:w16sdtdh="http://schemas.microsoft.com/office/word/2020/wordml/sdtdatahash" xmlns:w16sdtfl="http://schemas.microsoft.com/office/word/2024/wordml/sdtformatlock" xmlns:w16se="http://schemas.microsoft.com/office/word/2015/wordml/symex" xmlns:wpg="http://schemas.microsoft.com/office/word/2010/wordprocessingGroup" xmlns:wpi="http://schemas.microsoft.com/office/word/2010/wordprocessingInk" xmlns:wne="http://schemas.microsoft.com/office/word/2006/wordml" xmlns:wps="http://schemas.microsoft.com/office/word/2010/wordprocessingShape" mc:Ignorable="w14 w15 w16se w16cid w16 w16cex w16sdtdh w16sdtfl cr w16du wp14">
-  <w16cex:commentExtensible w16cex:durableId="01671FD6" w16cex:dateUtc="2024-01-19T09:03:00Z"/>
-  <w16cex:commentExtensible w16cex:durableId="7CF9044D" w16cex:dateUtc="2024-01-19T09:04:00Z"/>
   <w16cex:commentExtensible w16cex:durableId="6717A343" w16cex:dateUtc="2024-01-19T09:04:00Z"/>
 </w16cex:commentsExtensible>
 </file>
 
 <file path=word/commentsIds.xml><?xml version="1.0" encoding="utf-8"?>
 <w16cid:commentsIds xmlns:wpc="http://schemas.microsoft.com/office/word/2010/wordprocessingCanvas" xmlns:cx="http://schemas.microsoft.com/office/drawing/2014/chartex" xmlns:cx1="http://schemas.microsoft.com/office/drawing/2015/9/8/chartex" xmlns:cx2="http://schemas.microsoft.com/office/drawing/2015/10/21/chartex" xmlns:cx3="http://schemas.microsoft.com/office/drawing/2016/5/9/chartex" xmlns:cx4="http://schemas.microsoft.com/office/drawing/2016/5/10/chartex" xmlns:cx5="http://schemas.microsoft.com/office/drawing/2016/5/11/chartex" xmlns:cx6="http://schemas.microsoft.com/office/drawing/2016/5/12/chartex" xmlns:cx7="http://schemas.microsoft.com/office/drawing/2016/5/13/chartex" xmlns:cx8="http://schemas.microsoft.com/office/drawing/2016/5/14/chartex" xmlns:mc="http://schemas.openxmlformats.org/markup-compatibility/2006" xmlns:aink="http://schemas.microsoft.com/office/drawing/2016/ink" xmlns:am3d="http://schemas.microsoft.com/office/drawing/2017/model3d" xmlns:o="urn:schemas-microsoft-com:office:office" xmlns:oel="http://schemas.microsoft.com/office/2019/extlst" xmlns:r="http://schemas.openxmlformats.org/officeDocument/2006/relationships" xmlns:m="http://schemas.openxmlformats.org/officeDocument/2006/math" xmlns:v="urn:schemas-microsoft-com:vml" xmlns:wp14="http://schemas.microsoft.com/office/word/2010/wordprocessingDrawing" xmlns:wp="http://schemas.openxmlformats.org/drawingml/2006/wordprocessingDrawing" xmlns:w10="urn:schemas-microsoft-com:office:word" xmlns:w="http://schemas.openxmlformats.org/wordprocessingml/2006/main" xmlns:w14="http://schemas.microsoft.com/office/word/2010/wordml" xmlns:w15="http://schemas.microsoft.com/office/word/2012/wordml" xmlns:w16cex="http://schemas.microsoft.com/office/word/2018/wordml/cex" xmlns:w16cid="http://schemas.microsoft.com/office/word/2016/wordml/cid" xmlns:w16="http://schemas.microsoft.com/office/word/2018/wordml" xmlns:w16du="http://schemas.microsoft.com/office/word/2023/wordml/word16du" xmlns:w16sdtdh="http://schemas.microsoft.com/office/word/2020/wordml/sdtdatahash" xmlns:w16sdtfl="http://schemas.microsoft.com/office/word/2024/wordml/sdtformatlock" xmlns:w16se="http://schemas.microsoft.com/office/word/2015/wordml/symex" xmlns:wpg="http://schemas.microsoft.com/office/word/2010/wordprocessingGroup" xmlns:wpi="http://schemas.microsoft.com/office/word/2010/wordprocessingInk" xmlns:wne="http://schemas.microsoft.com/office/word/2006/wordml" xmlns:wps="http://schemas.microsoft.com/office/word/2010/wordprocessingShape" mc:Ignorable="w14 w15 w16se w16cid w16 w16cex w16sdtdh w16sdtfl w16du wp14">
-  <w16cid:commentId w16cid:paraId="4AA60EC5" w16cid:durableId="01671FD6"/>
-  <w16cid:commentId w16cid:paraId="281A3A95" w16cid:durableId="7CF9044D"/>
   <w16cid:commentId w16cid:paraId="140B60EE" w16cid:durableId="6717A343"/>
 </w16cid:commentsIds>
 </file>

</xml_diff>

<commit_message>
Week 9 materials completed and small adjustments to Assignment 2.
</commit_message>
<xml_diff>
--- a/Assessment/ECS8052 Assessment 1 Moderator Form.docx
+++ b/Assessment/ECS8052 Assessment 1 Moderator Form.docx
@@ -608,7 +608,7 @@
                 <w:noProof/>
               </w:rPr>
               <w:drawing>
-                <wp:inline distT="0" distB="0" distL="0" distR="0" wp14:anchorId="34FED9CA" wp14:editId="42CC21DD">
+                <wp:inline distT="0" distB="0" distL="0" distR="0" wp14:anchorId="34FED9CA" wp14:editId="2DCFD4D2">
                   <wp:extent cx="838200" cy="396240"/>
                   <wp:effectExtent l="0" t="0" r="0" b="3810"/>
                   <wp:docPr id="1602562280" name="Picture 1"/>
@@ -625,7 +625,7 @@
                           </pic:cNvPicPr>
                         </pic:nvPicPr>
                         <pic:blipFill>
-                          <a:blip r:embed="rId6" cstate="print">
+                          <a:blip r:embed="rId7" cstate="print">
                             <a:extLst>
                               <a:ext uri="{28A0092B-C50C-407E-A947-70E740481C1C}">
                                 <a14:useLocalDpi xmlns:a14="http://schemas.microsoft.com/office/drawing/2010/main" val="0"/>
@@ -669,13 +669,13 @@
         <w:tblLook w:val="04A0" w:firstRow="1" w:lastRow="0" w:firstColumn="1" w:lastColumn="0" w:noHBand="0" w:noVBand="1"/>
       </w:tblPr>
       <w:tblGrid>
-        <w:gridCol w:w="4106"/>
-        <w:gridCol w:w="5670"/>
+        <w:gridCol w:w="2400"/>
+        <w:gridCol w:w="7376"/>
       </w:tblGrid>
       <w:tr>
         <w:tc>
           <w:tcPr>
-            <w:tcW w:w="4106" w:type="dxa"/>
+            <w:tcW w:w="2400" w:type="dxa"/>
           </w:tcPr>
           <w:p>
             <w:r>
@@ -685,7 +685,7 @@
         </w:tc>
         <w:tc>
           <w:tcPr>
-            <w:tcW w:w="5670" w:type="dxa"/>
+            <w:tcW w:w="7376" w:type="dxa"/>
           </w:tcPr>
           <w:p/>
         </w:tc>
@@ -696,7 +696,7 @@
         </w:trPr>
         <w:tc>
           <w:tcPr>
-            <w:tcW w:w="4106" w:type="dxa"/>
+            <w:tcW w:w="2400" w:type="dxa"/>
           </w:tcPr>
           <w:p>
             <w:r>
@@ -706,15 +706,16 @@
         </w:tc>
         <w:tc>
           <w:tcPr>
-            <w:tcW w:w="5670" w:type="dxa"/>
-          </w:tcPr>
+            <w:tcW w:w="7376" w:type="dxa"/>
+          </w:tcPr>
+          <w:p/>
           <w:p/>
         </w:tc>
       </w:tr>
       <w:tr>
         <w:tc>
           <w:tcPr>
-            <w:tcW w:w="4106" w:type="dxa"/>
+            <w:tcW w:w="2400" w:type="dxa"/>
           </w:tcPr>
           <w:p>
             <w:r>
@@ -724,7 +725,7 @@
         </w:tc>
         <w:tc>
           <w:tcPr>
-            <w:tcW w:w="5670" w:type="dxa"/>
+            <w:tcW w:w="7376" w:type="dxa"/>
           </w:tcPr>
           <w:p/>
         </w:tc>
@@ -732,7 +733,7 @@
       <w:tr>
         <w:tc>
           <w:tcPr>
-            <w:tcW w:w="4106" w:type="dxa"/>
+            <w:tcW w:w="2400" w:type="dxa"/>
           </w:tcPr>
           <w:p>
             <w:r>
@@ -742,7 +743,7 @@
         </w:tc>
         <w:tc>
           <w:tcPr>
-            <w:tcW w:w="5670" w:type="dxa"/>
+            <w:tcW w:w="7376" w:type="dxa"/>
           </w:tcPr>
           <w:p/>
         </w:tc>
@@ -880,7 +881,19 @@
           <w:tcPr>
             <w:tcW w:w="8296" w:type="dxa"/>
           </w:tcPr>
-          <w:p/>
+          <w:p>
+            <w:hyperlink r:id="rId8" w:history="1">
+              <w:r>
+                <w:rPr>
+                  <w:rStyle w:val="Hyperlink"/>
+                </w:rPr>
+                <w:t>https://canvas.qub.ac.uk/courses/32884/gradebook/speed_grader?assignment_id=235600&amp;student_id=121367</w:t>
+              </w:r>
+            </w:hyperlink>
+            <w:r>
+              <w:t xml:space="preserve"> </w:t>
+            </w:r>
+          </w:p>
         </w:tc>
       </w:tr>
       <w:tr>
@@ -911,7 +924,22 @@
           <w:tcPr>
             <w:tcW w:w="8296" w:type="dxa"/>
           </w:tcPr>
-          <w:p/>
+          <w:p>
+            <w:r>
+              <w:t xml:space="preserve">All feedback has been given via Speedgrader: </w:t>
+            </w:r>
+            <w:hyperlink r:id="rId9" w:history="1">
+              <w:r>
+                <w:rPr>
+                  <w:rStyle w:val="Hyperlink"/>
+                </w:rPr>
+                <w:t>https://canvas.qub.ac.uk/courses/32884/gradebook/speed_grader?assignment_id=235600&amp;student_id=121367</w:t>
+              </w:r>
+            </w:hyperlink>
+            <w:r>
+              <w:t xml:space="preserve"> </w:t>
+            </w:r>
+          </w:p>
         </w:tc>
       </w:tr>
     </w:tbl>
@@ -991,12 +1019,16 @@
           <w:tcPr>
             <w:tcW w:w="6237" w:type="dxa"/>
           </w:tcPr>
-          <w:p/>
+          <w:p>
+            <w:r>
+              <w:t>Dr Yang Hua</w:t>
+            </w:r>
+          </w:p>
         </w:tc>
       </w:tr>
       <w:tr>
         <w:trPr>
-          <w:trHeight w:val="834"/>
+          <w:trHeight w:val="1169"/>
         </w:trPr>
         <w:tc>
           <w:tcPr>
@@ -1015,6 +1047,1207 @@
           <w:tcPr>
             <w:tcW w:w="6237" w:type="dxa"/>
           </w:tcPr>
+          <w:p>
+            <w:r>
+              <w:t>The following submissions were considered covering the full range of grades</w:t>
+            </w:r>
+          </w:p>
+          <w:p/>
+          <w:tbl>
+            <w:tblPr>
+              <w:tblStyle w:val="TableGrid"/>
+              <w:tblW w:w="6011" w:type="dxa"/>
+              <w:tblLook w:val="04A0" w:firstRow="1" w:lastRow="0" w:firstColumn="1" w:lastColumn="0" w:noHBand="0" w:noVBand="1"/>
+            </w:tblPr>
+            <w:tblGrid>
+              <w:gridCol w:w="1301"/>
+              <w:gridCol w:w="1117"/>
+              <w:gridCol w:w="872"/>
+              <w:gridCol w:w="1564"/>
+              <w:gridCol w:w="1157"/>
+            </w:tblGrid>
+            <w:tr>
+              <w:trPr>
+                <w:trHeight w:val="854"/>
+              </w:trPr>
+              <w:tc>
+                <w:tcPr>
+                  <w:tcW w:w="1314" w:type="dxa"/>
+                  <w:vAlign w:val="center"/>
+                </w:tcPr>
+                <w:p>
+                  <w:pPr>
+                    <w:rPr>
+                      <w:sz w:val="20"/>
+                      <w:szCs w:val="20"/>
+                      <w:lang w:val="en-US"/>
+                    </w:rPr>
+                  </w:pPr>
+                  <w:r>
+                    <w:rPr>
+                      <w:sz w:val="20"/>
+                      <w:szCs w:val="20"/>
+                      <w:lang w:val="en-US"/>
+                    </w:rPr>
+                    <w:t>Submission</w:t>
+                  </w:r>
+                </w:p>
+              </w:tc>
+              <w:tc>
+                <w:tcPr>
+                  <w:tcW w:w="1125" w:type="dxa"/>
+                  <w:vAlign w:val="center"/>
+                </w:tcPr>
+                <w:p>
+                  <w:pPr>
+                    <w:rPr>
+                      <w:sz w:val="20"/>
+                      <w:szCs w:val="20"/>
+                      <w:lang w:val="en-US"/>
+                    </w:rPr>
+                  </w:pPr>
+                  <w:r>
+                    <w:rPr>
+                      <w:sz w:val="20"/>
+                      <w:szCs w:val="20"/>
+                      <w:lang w:val="en-US"/>
+                    </w:rPr>
+                    <w:t>ID</w:t>
+                  </w:r>
+                </w:p>
+              </w:tc>
+              <w:tc>
+                <w:tcPr>
+                  <w:tcW w:w="837" w:type="dxa"/>
+                  <w:vAlign w:val="center"/>
+                </w:tcPr>
+                <w:p>
+                  <w:pPr>
+                    <w:rPr>
+                      <w:sz w:val="20"/>
+                      <w:szCs w:val="20"/>
+                      <w:lang w:val="en-US"/>
+                    </w:rPr>
+                  </w:pPr>
+                  <w:r>
+                    <w:rPr>
+                      <w:sz w:val="20"/>
+                      <w:szCs w:val="20"/>
+                      <w:lang w:val="en-US"/>
+                    </w:rPr>
+                    <w:t>Grade</w:t>
+                  </w:r>
+                </w:p>
+              </w:tc>
+              <w:tc>
+                <w:tcPr>
+                  <w:tcW w:w="1572" w:type="dxa"/>
+                  <w:vAlign w:val="center"/>
+                </w:tcPr>
+                <w:p>
+                  <w:pPr>
+                    <w:rPr>
+                      <w:sz w:val="20"/>
+                      <w:szCs w:val="20"/>
+                      <w:lang w:val="en-US"/>
+                    </w:rPr>
+                  </w:pPr>
+                  <w:r>
+                    <w:rPr>
+                      <w:sz w:val="20"/>
+                      <w:szCs w:val="20"/>
+                      <w:lang w:val="en-US"/>
+                    </w:rPr>
+                    <w:t>Moderator Agree/Disagree</w:t>
+                  </w:r>
+                </w:p>
+              </w:tc>
+              <w:tc>
+                <w:tcPr>
+                  <w:tcW w:w="1163" w:type="dxa"/>
+                  <w:vAlign w:val="center"/>
+                </w:tcPr>
+                <w:p>
+                  <w:pPr>
+                    <w:rPr>
+                      <w:sz w:val="20"/>
+                      <w:szCs w:val="20"/>
+                      <w:lang w:val="en-US"/>
+                    </w:rPr>
+                  </w:pPr>
+                  <w:r>
+                    <w:rPr>
+                      <w:sz w:val="20"/>
+                      <w:szCs w:val="20"/>
+                      <w:lang w:val="en-US"/>
+                    </w:rPr>
+                    <w:t xml:space="preserve">Comments </w:t>
+                  </w:r>
+                </w:p>
+              </w:tc>
+            </w:tr>
+            <w:tr>
+              <w:trPr>
+                <w:trHeight w:val="567"/>
+              </w:trPr>
+              <w:tc>
+                <w:tcPr>
+                  <w:tcW w:w="1314" w:type="dxa"/>
+                  <w:vAlign w:val="center"/>
+                </w:tcPr>
+                <w:p>
+                  <w:pPr>
+                    <w:rPr>
+                      <w:sz w:val="20"/>
+                      <w:szCs w:val="20"/>
+                      <w:lang w:val="en-US"/>
+                    </w:rPr>
+                  </w:pPr>
+                  <w:r>
+                    <w:rPr>
+                      <w:sz w:val="20"/>
+                      <w:szCs w:val="20"/>
+                      <w:lang w:val="en-US"/>
+                    </w:rPr>
+                    <w:t>Student 1</w:t>
+                  </w:r>
+                </w:p>
+              </w:tc>
+              <w:tc>
+                <w:tcPr>
+                  <w:tcW w:w="1125" w:type="dxa"/>
+                  <w:vAlign w:val="center"/>
+                </w:tcPr>
+                <w:p>
+                  <w:pPr>
+                    <w:rPr>
+                      <w:sz w:val="20"/>
+                      <w:szCs w:val="20"/>
+                      <w:lang w:val="en-US"/>
+                    </w:rPr>
+                  </w:pPr>
+                  <w:r>
+                    <w:rPr>
+                      <w:sz w:val="20"/>
+                      <w:szCs w:val="20"/>
+                      <w:lang w:val="en-US"/>
+                    </w:rPr>
+                    <w:t>40497341</w:t>
+                  </w:r>
+                </w:p>
+              </w:tc>
+              <w:tc>
+                <w:tcPr>
+                  <w:tcW w:w="837" w:type="dxa"/>
+                  <w:vAlign w:val="center"/>
+                </w:tcPr>
+                <w:p>
+                  <w:pPr>
+                    <w:rPr>
+                      <w:sz w:val="20"/>
+                      <w:szCs w:val="20"/>
+                      <w:lang w:val="en-US"/>
+                    </w:rPr>
+                  </w:pPr>
+                  <w:r>
+                    <w:rPr>
+                      <w:sz w:val="20"/>
+                      <w:szCs w:val="20"/>
+                      <w:lang w:val="en-US"/>
+                    </w:rPr>
+                    <w:t>61</w:t>
+                  </w:r>
+                </w:p>
+              </w:tc>
+              <w:tc>
+                <w:tcPr>
+                  <w:tcW w:w="1572" w:type="dxa"/>
+                  <w:vAlign w:val="center"/>
+                </w:tcPr>
+                <w:p>
+                  <w:pPr>
+                    <w:rPr>
+                      <w:sz w:val="20"/>
+                      <w:szCs w:val="20"/>
+                      <w:lang w:val="en-US"/>
+                    </w:rPr>
+                  </w:pPr>
+                  <w:r>
+                    <w:rPr>
+                      <w:sz w:val="20"/>
+                      <w:szCs w:val="20"/>
+                      <w:lang w:val="en-US"/>
+                    </w:rPr>
+                    <w:t>Agree</w:t>
+                  </w:r>
+                </w:p>
+              </w:tc>
+              <w:tc>
+                <w:tcPr>
+                  <w:tcW w:w="1163" w:type="dxa"/>
+                  <w:vAlign w:val="center"/>
+                </w:tcPr>
+                <w:p>
+                  <w:pPr>
+                    <w:rPr>
+                      <w:sz w:val="20"/>
+                      <w:szCs w:val="20"/>
+                      <w:lang w:val="en-US"/>
+                    </w:rPr>
+                  </w:pPr>
+                </w:p>
+              </w:tc>
+            </w:tr>
+            <w:tr>
+              <w:trPr>
+                <w:trHeight w:val="573"/>
+              </w:trPr>
+              <w:tc>
+                <w:tcPr>
+                  <w:tcW w:w="1314" w:type="dxa"/>
+                  <w:vAlign w:val="center"/>
+                </w:tcPr>
+                <w:p>
+                  <w:pPr>
+                    <w:rPr>
+                      <w:sz w:val="20"/>
+                      <w:szCs w:val="20"/>
+                      <w:lang w:val="en-US"/>
+                    </w:rPr>
+                  </w:pPr>
+                  <w:r>
+                    <w:rPr>
+                      <w:sz w:val="20"/>
+                      <w:szCs w:val="20"/>
+                      <w:lang w:val="en-US"/>
+                    </w:rPr>
+                    <w:t>Student 7</w:t>
+                  </w:r>
+                </w:p>
+              </w:tc>
+              <w:tc>
+                <w:tcPr>
+                  <w:tcW w:w="1125" w:type="dxa"/>
+                  <w:vAlign w:val="center"/>
+                </w:tcPr>
+                <w:p>
+                  <w:pPr>
+                    <w:rPr>
+                      <w:sz w:val="20"/>
+                      <w:szCs w:val="20"/>
+                      <w:lang w:val="en-US"/>
+                    </w:rPr>
+                  </w:pPr>
+                  <w:r>
+                    <w:rPr>
+                      <w:sz w:val="20"/>
+                      <w:szCs w:val="20"/>
+                      <w:lang w:val="en-US"/>
+                    </w:rPr>
+                    <w:t>40493512</w:t>
+                  </w:r>
+                </w:p>
+              </w:tc>
+              <w:tc>
+                <w:tcPr>
+                  <w:tcW w:w="837" w:type="dxa"/>
+                  <w:vAlign w:val="center"/>
+                </w:tcPr>
+                <w:p>
+                  <w:pPr>
+                    <w:rPr>
+                      <w:sz w:val="20"/>
+                      <w:szCs w:val="20"/>
+                      <w:lang w:val="en-US"/>
+                    </w:rPr>
+                  </w:pPr>
+                  <w:r>
+                    <w:rPr>
+                      <w:sz w:val="20"/>
+                      <w:szCs w:val="20"/>
+                      <w:lang w:val="en-US"/>
+                    </w:rPr>
+                    <w:t>58</w:t>
+                  </w:r>
+                </w:p>
+              </w:tc>
+              <w:tc>
+                <w:tcPr>
+                  <w:tcW w:w="1572" w:type="dxa"/>
+                  <w:vAlign w:val="center"/>
+                </w:tcPr>
+                <w:p>
+                  <w:pPr>
+                    <w:rPr>
+                      <w:sz w:val="20"/>
+                      <w:szCs w:val="20"/>
+                      <w:lang w:val="en-US"/>
+                    </w:rPr>
+                  </w:pPr>
+                  <w:r>
+                    <w:rPr>
+                      <w:sz w:val="20"/>
+                      <w:szCs w:val="20"/>
+                      <w:lang w:val="en-US"/>
+                    </w:rPr>
+                    <w:t>Agree</w:t>
+                  </w:r>
+                </w:p>
+              </w:tc>
+              <w:tc>
+                <w:tcPr>
+                  <w:tcW w:w="1163" w:type="dxa"/>
+                  <w:vAlign w:val="center"/>
+                </w:tcPr>
+                <w:p>
+                  <w:pPr>
+                    <w:rPr>
+                      <w:sz w:val="20"/>
+                      <w:szCs w:val="20"/>
+                      <w:lang w:val="en-US"/>
+                    </w:rPr>
+                  </w:pPr>
+                </w:p>
+              </w:tc>
+            </w:tr>
+            <w:tr>
+              <w:trPr>
+                <w:trHeight w:val="567"/>
+              </w:trPr>
+              <w:tc>
+                <w:tcPr>
+                  <w:tcW w:w="1314" w:type="dxa"/>
+                  <w:vAlign w:val="center"/>
+                </w:tcPr>
+                <w:p>
+                  <w:pPr>
+                    <w:rPr>
+                      <w:sz w:val="20"/>
+                      <w:szCs w:val="20"/>
+                      <w:lang w:val="en-US"/>
+                    </w:rPr>
+                  </w:pPr>
+                  <w:r>
+                    <w:rPr>
+                      <w:sz w:val="20"/>
+                      <w:szCs w:val="20"/>
+                      <w:lang w:val="en-US"/>
+                    </w:rPr>
+                    <w:t>Student 17</w:t>
+                  </w:r>
+                </w:p>
+              </w:tc>
+              <w:tc>
+                <w:tcPr>
+                  <w:tcW w:w="1125" w:type="dxa"/>
+                  <w:vAlign w:val="center"/>
+                </w:tcPr>
+                <w:p>
+                  <w:pPr>
+                    <w:rPr>
+                      <w:sz w:val="20"/>
+                      <w:szCs w:val="20"/>
+                      <w:lang w:val="en-US"/>
+                    </w:rPr>
+                  </w:pPr>
+                  <w:r>
+                    <w:rPr>
+                      <w:sz w:val="20"/>
+                      <w:szCs w:val="20"/>
+                      <w:lang w:val="en-US"/>
+                    </w:rPr>
+                    <w:t>40267278</w:t>
+                  </w:r>
+                </w:p>
+              </w:tc>
+              <w:tc>
+                <w:tcPr>
+                  <w:tcW w:w="837" w:type="dxa"/>
+                  <w:vAlign w:val="center"/>
+                </w:tcPr>
+                <w:p>
+                  <w:pPr>
+                    <w:rPr>
+                      <w:sz w:val="20"/>
+                      <w:szCs w:val="20"/>
+                      <w:lang w:val="en-US"/>
+                    </w:rPr>
+                  </w:pPr>
+                  <w:r>
+                    <w:rPr>
+                      <w:sz w:val="20"/>
+                      <w:szCs w:val="20"/>
+                      <w:lang w:val="en-US"/>
+                    </w:rPr>
+                    <w:t>88</w:t>
+                  </w:r>
+                </w:p>
+              </w:tc>
+              <w:tc>
+                <w:tcPr>
+                  <w:tcW w:w="1572" w:type="dxa"/>
+                  <w:vAlign w:val="center"/>
+                </w:tcPr>
+                <w:p>
+                  <w:pPr>
+                    <w:rPr>
+                      <w:sz w:val="20"/>
+                      <w:szCs w:val="20"/>
+                      <w:lang w:val="en-US"/>
+                    </w:rPr>
+                  </w:pPr>
+                  <w:r>
+                    <w:rPr>
+                      <w:sz w:val="20"/>
+                      <w:szCs w:val="20"/>
+                      <w:lang w:val="en-US"/>
+                    </w:rPr>
+                    <w:t>Agree</w:t>
+                  </w:r>
+                </w:p>
+              </w:tc>
+              <w:tc>
+                <w:tcPr>
+                  <w:tcW w:w="1163" w:type="dxa"/>
+                  <w:vAlign w:val="center"/>
+                </w:tcPr>
+                <w:p>
+                  <w:pPr>
+                    <w:rPr>
+                      <w:sz w:val="20"/>
+                      <w:szCs w:val="20"/>
+                      <w:lang w:val="en-US"/>
+                    </w:rPr>
+                  </w:pPr>
+                </w:p>
+              </w:tc>
+            </w:tr>
+            <w:tr>
+              <w:trPr>
+                <w:trHeight w:val="567"/>
+              </w:trPr>
+              <w:tc>
+                <w:tcPr>
+                  <w:tcW w:w="1314" w:type="dxa"/>
+                  <w:vAlign w:val="center"/>
+                </w:tcPr>
+                <w:p>
+                  <w:pPr>
+                    <w:rPr>
+                      <w:sz w:val="20"/>
+                      <w:szCs w:val="20"/>
+                      <w:lang w:val="en-US"/>
+                    </w:rPr>
+                  </w:pPr>
+                  <w:r>
+                    <w:rPr>
+                      <w:sz w:val="20"/>
+                      <w:szCs w:val="20"/>
+                      <w:lang w:val="en-US"/>
+                    </w:rPr>
+                    <w:t>Student 21</w:t>
+                  </w:r>
+                </w:p>
+              </w:tc>
+              <w:tc>
+                <w:tcPr>
+                  <w:tcW w:w="1125" w:type="dxa"/>
+                  <w:vAlign w:val="center"/>
+                </w:tcPr>
+                <w:p>
+                  <w:pPr>
+                    <w:rPr>
+                      <w:sz w:val="20"/>
+                      <w:szCs w:val="20"/>
+                      <w:lang w:val="en-US"/>
+                    </w:rPr>
+                  </w:pPr>
+                  <w:r>
+                    <w:rPr>
+                      <w:sz w:val="20"/>
+                      <w:szCs w:val="20"/>
+                      <w:lang w:val="en-US"/>
+                    </w:rPr>
+                    <w:t>40498281</w:t>
+                  </w:r>
+                </w:p>
+              </w:tc>
+              <w:tc>
+                <w:tcPr>
+                  <w:tcW w:w="837" w:type="dxa"/>
+                  <w:vAlign w:val="center"/>
+                </w:tcPr>
+                <w:p>
+                  <w:pPr>
+                    <w:rPr>
+                      <w:sz w:val="20"/>
+                      <w:szCs w:val="20"/>
+                      <w:lang w:val="en-US"/>
+                    </w:rPr>
+                  </w:pPr>
+                  <w:r>
+                    <w:rPr>
+                      <w:sz w:val="20"/>
+                      <w:szCs w:val="20"/>
+                      <w:lang w:val="en-US"/>
+                    </w:rPr>
+                    <w:t>65</w:t>
+                  </w:r>
+                </w:p>
+              </w:tc>
+              <w:tc>
+                <w:tcPr>
+                  <w:tcW w:w="1572" w:type="dxa"/>
+                  <w:vAlign w:val="center"/>
+                </w:tcPr>
+                <w:p>
+                  <w:pPr>
+                    <w:rPr>
+                      <w:sz w:val="20"/>
+                      <w:szCs w:val="20"/>
+                      <w:lang w:val="en-US"/>
+                    </w:rPr>
+                  </w:pPr>
+                  <w:r>
+                    <w:rPr>
+                      <w:sz w:val="20"/>
+                      <w:szCs w:val="20"/>
+                      <w:lang w:val="en-US"/>
+                    </w:rPr>
+                    <w:t>Agree</w:t>
+                  </w:r>
+                </w:p>
+              </w:tc>
+              <w:tc>
+                <w:tcPr>
+                  <w:tcW w:w="1163" w:type="dxa"/>
+                  <w:vAlign w:val="center"/>
+                </w:tcPr>
+                <w:p>
+                  <w:pPr>
+                    <w:rPr>
+                      <w:sz w:val="20"/>
+                      <w:szCs w:val="20"/>
+                      <w:lang w:val="en-US"/>
+                    </w:rPr>
+                  </w:pPr>
+                </w:p>
+              </w:tc>
+            </w:tr>
+            <w:tr>
+              <w:trPr>
+                <w:trHeight w:val="1142"/>
+              </w:trPr>
+              <w:tc>
+                <w:tcPr>
+                  <w:tcW w:w="1314" w:type="dxa"/>
+                  <w:vAlign w:val="center"/>
+                </w:tcPr>
+                <w:p>
+                  <w:pPr>
+                    <w:rPr>
+                      <w:sz w:val="20"/>
+                      <w:szCs w:val="20"/>
+                      <w:lang w:val="en-US"/>
+                    </w:rPr>
+                  </w:pPr>
+                  <w:r>
+                    <w:rPr>
+                      <w:sz w:val="20"/>
+                      <w:szCs w:val="20"/>
+                      <w:lang w:val="en-US"/>
+                    </w:rPr>
+                    <w:t>Student 22</w:t>
+                  </w:r>
+                </w:p>
+              </w:tc>
+              <w:tc>
+                <w:tcPr>
+                  <w:tcW w:w="1125" w:type="dxa"/>
+                  <w:vAlign w:val="center"/>
+                </w:tcPr>
+                <w:p>
+                  <w:pPr>
+                    <w:rPr>
+                      <w:sz w:val="20"/>
+                      <w:szCs w:val="20"/>
+                      <w:lang w:val="en-US"/>
+                    </w:rPr>
+                  </w:pPr>
+                  <w:r>
+                    <w:rPr>
+                      <w:sz w:val="20"/>
+                      <w:szCs w:val="20"/>
+                      <w:lang w:val="en-US"/>
+                    </w:rPr>
+                    <w:t>40494846</w:t>
+                  </w:r>
+                </w:p>
+              </w:tc>
+              <w:tc>
+                <w:tcPr>
+                  <w:tcW w:w="837" w:type="dxa"/>
+                  <w:vAlign w:val="center"/>
+                </w:tcPr>
+                <w:p>
+                  <w:pPr>
+                    <w:rPr>
+                      <w:sz w:val="20"/>
+                      <w:szCs w:val="20"/>
+                      <w:lang w:val="en-US"/>
+                    </w:rPr>
+                  </w:pPr>
+                  <w:r>
+                    <w:rPr>
+                      <w:sz w:val="20"/>
+                      <w:szCs w:val="20"/>
+                      <w:lang w:val="en-US"/>
+                    </w:rPr>
+                    <w:t>45 (-5 with late penalty)</w:t>
+                  </w:r>
+                </w:p>
+              </w:tc>
+              <w:tc>
+                <w:tcPr>
+                  <w:tcW w:w="1572" w:type="dxa"/>
+                  <w:vAlign w:val="center"/>
+                </w:tcPr>
+                <w:p>
+                  <w:pPr>
+                    <w:rPr>
+                      <w:sz w:val="20"/>
+                      <w:szCs w:val="20"/>
+                      <w:lang w:val="en-US"/>
+                    </w:rPr>
+                  </w:pPr>
+                  <w:r>
+                    <w:rPr>
+                      <w:sz w:val="20"/>
+                      <w:szCs w:val="20"/>
+                      <w:lang w:val="en-US"/>
+                    </w:rPr>
+                    <w:t>Agree</w:t>
+                  </w:r>
+                </w:p>
+              </w:tc>
+              <w:tc>
+                <w:tcPr>
+                  <w:tcW w:w="1163" w:type="dxa"/>
+                  <w:vAlign w:val="center"/>
+                </w:tcPr>
+                <w:p>
+                  <w:pPr>
+                    <w:rPr>
+                      <w:sz w:val="20"/>
+                      <w:szCs w:val="20"/>
+                      <w:lang w:val="en-US"/>
+                    </w:rPr>
+                  </w:pPr>
+                </w:p>
+              </w:tc>
+            </w:tr>
+            <w:tr>
+              <w:trPr>
+                <w:trHeight w:val="281"/>
+              </w:trPr>
+              <w:tc>
+                <w:tcPr>
+                  <w:tcW w:w="1314" w:type="dxa"/>
+                  <w:vAlign w:val="center"/>
+                </w:tcPr>
+                <w:p>
+                  <w:pPr>
+                    <w:rPr>
+                      <w:sz w:val="20"/>
+                      <w:szCs w:val="20"/>
+                      <w:lang w:val="en-US"/>
+                    </w:rPr>
+                  </w:pPr>
+                  <w:r>
+                    <w:rPr>
+                      <w:sz w:val="20"/>
+                      <w:szCs w:val="20"/>
+                      <w:lang w:val="en-US"/>
+                    </w:rPr>
+                    <w:t>Student 2</w:t>
+                  </w:r>
+                  <w:r>
+                    <w:rPr>
+                      <w:sz w:val="20"/>
+                      <w:szCs w:val="20"/>
+                      <w:lang w:val="en-US"/>
+                    </w:rPr>
+                    <w:t>8</w:t>
+                  </w:r>
+                </w:p>
+              </w:tc>
+              <w:tc>
+                <w:tcPr>
+                  <w:tcW w:w="1125" w:type="dxa"/>
+                  <w:vAlign w:val="center"/>
+                </w:tcPr>
+                <w:p>
+                  <w:pPr>
+                    <w:rPr>
+                      <w:sz w:val="20"/>
+                      <w:szCs w:val="20"/>
+                      <w:lang w:val="en-US"/>
+                    </w:rPr>
+                  </w:pPr>
+                  <w:r>
+                    <w:rPr>
+                      <w:sz w:val="20"/>
+                      <w:szCs w:val="20"/>
+                      <w:lang w:val="en-US"/>
+                    </w:rPr>
+                    <w:t>40299386</w:t>
+                  </w:r>
+                </w:p>
+              </w:tc>
+              <w:tc>
+                <w:tcPr>
+                  <w:tcW w:w="837" w:type="dxa"/>
+                  <w:vAlign w:val="center"/>
+                </w:tcPr>
+                <w:p>
+                  <w:pPr>
+                    <w:rPr>
+                      <w:sz w:val="20"/>
+                      <w:szCs w:val="20"/>
+                      <w:lang w:val="en-US"/>
+                    </w:rPr>
+                  </w:pPr>
+                  <w:r>
+                    <w:rPr>
+                      <w:sz w:val="20"/>
+                      <w:szCs w:val="20"/>
+                      <w:lang w:val="en-US"/>
+                    </w:rPr>
+                    <w:t>90</w:t>
+                  </w:r>
+                </w:p>
+              </w:tc>
+              <w:tc>
+                <w:tcPr>
+                  <w:tcW w:w="1572" w:type="dxa"/>
+                  <w:vAlign w:val="center"/>
+                </w:tcPr>
+                <w:p>
+                  <w:pPr>
+                    <w:rPr>
+                      <w:sz w:val="20"/>
+                      <w:szCs w:val="20"/>
+                      <w:lang w:val="en-US"/>
+                    </w:rPr>
+                  </w:pPr>
+                  <w:r>
+                    <w:rPr>
+                      <w:sz w:val="20"/>
+                      <w:szCs w:val="20"/>
+                      <w:lang w:val="en-US"/>
+                    </w:rPr>
+                    <w:t>Agree</w:t>
+                  </w:r>
+                </w:p>
+              </w:tc>
+              <w:tc>
+                <w:tcPr>
+                  <w:tcW w:w="1163" w:type="dxa"/>
+                  <w:vAlign w:val="center"/>
+                </w:tcPr>
+                <w:p>
+                  <w:pPr>
+                    <w:rPr>
+                      <w:sz w:val="20"/>
+                      <w:szCs w:val="20"/>
+                      <w:lang w:val="en-US"/>
+                    </w:rPr>
+                  </w:pPr>
+                </w:p>
+              </w:tc>
+            </w:tr>
+            <w:tr>
+              <w:trPr>
+                <w:trHeight w:val="286"/>
+              </w:trPr>
+              <w:tc>
+                <w:tcPr>
+                  <w:tcW w:w="1314" w:type="dxa"/>
+                  <w:vAlign w:val="center"/>
+                </w:tcPr>
+                <w:p>
+                  <w:pPr>
+                    <w:rPr>
+                      <w:sz w:val="20"/>
+                      <w:szCs w:val="20"/>
+                      <w:lang w:val="en-US"/>
+                    </w:rPr>
+                  </w:pPr>
+                  <w:r>
+                    <w:rPr>
+                      <w:sz w:val="20"/>
+                      <w:szCs w:val="20"/>
+                      <w:lang w:val="en-US"/>
+                    </w:rPr>
+                    <w:t xml:space="preserve">Student </w:t>
+                  </w:r>
+                  <w:r>
+                    <w:rPr>
+                      <w:sz w:val="20"/>
+                      <w:szCs w:val="20"/>
+                      <w:lang w:val="en-US"/>
+                    </w:rPr>
+                    <w:t>42</w:t>
+                  </w:r>
+                </w:p>
+              </w:tc>
+              <w:tc>
+                <w:tcPr>
+                  <w:tcW w:w="1125" w:type="dxa"/>
+                  <w:vAlign w:val="center"/>
+                </w:tcPr>
+                <w:p>
+                  <w:pPr>
+                    <w:rPr>
+                      <w:sz w:val="20"/>
+                      <w:szCs w:val="20"/>
+                      <w:lang w:val="en-US"/>
+                    </w:rPr>
+                  </w:pPr>
+                  <w:r>
+                    <w:rPr>
+                      <w:sz w:val="20"/>
+                      <w:szCs w:val="20"/>
+                      <w:lang w:val="en-US"/>
+                    </w:rPr>
+                    <w:t>40228049</w:t>
+                  </w:r>
+                </w:p>
+              </w:tc>
+              <w:tc>
+                <w:tcPr>
+                  <w:tcW w:w="837" w:type="dxa"/>
+                  <w:vAlign w:val="center"/>
+                </w:tcPr>
+                <w:p>
+                  <w:pPr>
+                    <w:rPr>
+                      <w:sz w:val="20"/>
+                      <w:szCs w:val="20"/>
+                      <w:lang w:val="en-US"/>
+                    </w:rPr>
+                  </w:pPr>
+                  <w:r>
+                    <w:rPr>
+                      <w:sz w:val="20"/>
+                      <w:szCs w:val="20"/>
+                      <w:lang w:val="en-US"/>
+                    </w:rPr>
+                    <w:t>76</w:t>
+                  </w:r>
+                </w:p>
+              </w:tc>
+              <w:tc>
+                <w:tcPr>
+                  <w:tcW w:w="1572" w:type="dxa"/>
+                  <w:vAlign w:val="center"/>
+                </w:tcPr>
+                <w:p>
+                  <w:pPr>
+                    <w:rPr>
+                      <w:sz w:val="20"/>
+                      <w:szCs w:val="20"/>
+                      <w:lang w:val="en-US"/>
+                    </w:rPr>
+                  </w:pPr>
+                  <w:r>
+                    <w:rPr>
+                      <w:sz w:val="20"/>
+                      <w:szCs w:val="20"/>
+                      <w:lang w:val="en-US"/>
+                    </w:rPr>
+                    <w:t>Agree</w:t>
+                  </w:r>
+                </w:p>
+              </w:tc>
+              <w:tc>
+                <w:tcPr>
+                  <w:tcW w:w="1163" w:type="dxa"/>
+                  <w:vAlign w:val="center"/>
+                </w:tcPr>
+                <w:p>
+                  <w:pPr>
+                    <w:rPr>
+                      <w:sz w:val="20"/>
+                      <w:szCs w:val="20"/>
+                      <w:lang w:val="en-US"/>
+                    </w:rPr>
+                  </w:pPr>
+                </w:p>
+              </w:tc>
+            </w:tr>
+            <w:tr>
+              <w:trPr>
+                <w:trHeight w:val="286"/>
+              </w:trPr>
+              <w:tc>
+                <w:tcPr>
+                  <w:tcW w:w="1314" w:type="dxa"/>
+                  <w:vAlign w:val="center"/>
+                </w:tcPr>
+                <w:p>
+                  <w:pPr>
+                    <w:rPr>
+                      <w:sz w:val="20"/>
+                      <w:szCs w:val="20"/>
+                      <w:lang w:val="en-US"/>
+                    </w:rPr>
+                  </w:pPr>
+                  <w:r>
+                    <w:rPr>
+                      <w:sz w:val="20"/>
+                      <w:szCs w:val="20"/>
+                      <w:lang w:val="en-US"/>
+                    </w:rPr>
+                    <w:t xml:space="preserve">Student </w:t>
+                  </w:r>
+                  <w:r>
+                    <w:rPr>
+                      <w:sz w:val="20"/>
+                      <w:szCs w:val="20"/>
+                      <w:lang w:val="en-US"/>
+                    </w:rPr>
+                    <w:t>57</w:t>
+                  </w:r>
+                </w:p>
+              </w:tc>
+              <w:tc>
+                <w:tcPr>
+                  <w:tcW w:w="1125" w:type="dxa"/>
+                  <w:vAlign w:val="center"/>
+                </w:tcPr>
+                <w:p>
+                  <w:pPr>
+                    <w:rPr>
+                      <w:sz w:val="20"/>
+                      <w:szCs w:val="20"/>
+                      <w:lang w:val="en-US"/>
+                    </w:rPr>
+                  </w:pPr>
+                  <w:r>
+                    <w:rPr>
+                      <w:sz w:val="20"/>
+                      <w:szCs w:val="20"/>
+                      <w:lang w:val="en-US"/>
+                    </w:rPr>
+                    <w:t>40480172</w:t>
+                  </w:r>
+                </w:p>
+              </w:tc>
+              <w:tc>
+                <w:tcPr>
+                  <w:tcW w:w="837" w:type="dxa"/>
+                  <w:vAlign w:val="center"/>
+                </w:tcPr>
+                <w:p>
+                  <w:pPr>
+                    <w:rPr>
+                      <w:sz w:val="20"/>
+                      <w:szCs w:val="20"/>
+                      <w:lang w:val="en-US"/>
+                    </w:rPr>
+                  </w:pPr>
+                  <w:r>
+                    <w:rPr>
+                      <w:sz w:val="20"/>
+                      <w:szCs w:val="20"/>
+                      <w:lang w:val="en-US"/>
+                    </w:rPr>
+                    <w:t>71</w:t>
+                  </w:r>
+                </w:p>
+              </w:tc>
+              <w:tc>
+                <w:tcPr>
+                  <w:tcW w:w="1572" w:type="dxa"/>
+                  <w:vAlign w:val="center"/>
+                </w:tcPr>
+                <w:p>
+                  <w:pPr>
+                    <w:rPr>
+                      <w:sz w:val="20"/>
+                      <w:szCs w:val="20"/>
+                      <w:lang w:val="en-US"/>
+                    </w:rPr>
+                  </w:pPr>
+                  <w:r>
+                    <w:rPr>
+                      <w:sz w:val="20"/>
+                      <w:szCs w:val="20"/>
+                      <w:lang w:val="en-US"/>
+                    </w:rPr>
+                    <w:t>Agree</w:t>
+                  </w:r>
+                </w:p>
+              </w:tc>
+              <w:tc>
+                <w:tcPr>
+                  <w:tcW w:w="1163" w:type="dxa"/>
+                  <w:vAlign w:val="center"/>
+                </w:tcPr>
+                <w:p>
+                  <w:pPr>
+                    <w:rPr>
+                      <w:sz w:val="20"/>
+                      <w:szCs w:val="20"/>
+                      <w:lang w:val="en-US"/>
+                    </w:rPr>
+                  </w:pPr>
+                </w:p>
+              </w:tc>
+            </w:tr>
+            <w:tr>
+              <w:trPr>
+                <w:trHeight w:val="286"/>
+              </w:trPr>
+              <w:tc>
+                <w:tcPr>
+                  <w:tcW w:w="1314" w:type="dxa"/>
+                  <w:vAlign w:val="center"/>
+                </w:tcPr>
+                <w:p>
+                  <w:pPr>
+                    <w:rPr>
+                      <w:sz w:val="20"/>
+                      <w:szCs w:val="20"/>
+                      <w:lang w:val="en-US"/>
+                    </w:rPr>
+                  </w:pPr>
+                  <w:r>
+                    <w:rPr>
+                      <w:sz w:val="20"/>
+                      <w:szCs w:val="20"/>
+                      <w:lang w:val="en-US"/>
+                    </w:rPr>
+                    <w:t xml:space="preserve">Student </w:t>
+                  </w:r>
+                  <w:r>
+                    <w:rPr>
+                      <w:sz w:val="20"/>
+                      <w:szCs w:val="20"/>
+                      <w:lang w:val="en-US"/>
+                    </w:rPr>
+                    <w:t>67</w:t>
+                  </w:r>
+                </w:p>
+              </w:tc>
+              <w:tc>
+                <w:tcPr>
+                  <w:tcW w:w="1125" w:type="dxa"/>
+                  <w:vAlign w:val="center"/>
+                </w:tcPr>
+                <w:p>
+                  <w:pPr>
+                    <w:rPr>
+                      <w:sz w:val="20"/>
+                      <w:szCs w:val="20"/>
+                      <w:lang w:val="en-US"/>
+                    </w:rPr>
+                  </w:pPr>
+                  <w:r>
+                    <w:rPr>
+                      <w:sz w:val="20"/>
+                      <w:szCs w:val="20"/>
+                      <w:lang w:val="en-US"/>
+                    </w:rPr>
+                    <w:t>40210425</w:t>
+                  </w:r>
+                </w:p>
+              </w:tc>
+              <w:tc>
+                <w:tcPr>
+                  <w:tcW w:w="837" w:type="dxa"/>
+                  <w:vAlign w:val="center"/>
+                </w:tcPr>
+                <w:p>
+                  <w:pPr>
+                    <w:rPr>
+                      <w:sz w:val="20"/>
+                      <w:szCs w:val="20"/>
+                      <w:lang w:val="en-US"/>
+                    </w:rPr>
+                  </w:pPr>
+                  <w:r>
+                    <w:rPr>
+                      <w:sz w:val="20"/>
+                      <w:szCs w:val="20"/>
+                      <w:lang w:val="en-US"/>
+                    </w:rPr>
+                    <w:t>82</w:t>
+                  </w:r>
+                </w:p>
+              </w:tc>
+              <w:tc>
+                <w:tcPr>
+                  <w:tcW w:w="1572" w:type="dxa"/>
+                  <w:vAlign w:val="center"/>
+                </w:tcPr>
+                <w:p>
+                  <w:pPr>
+                    <w:rPr>
+                      <w:sz w:val="20"/>
+                      <w:szCs w:val="20"/>
+                      <w:lang w:val="en-US"/>
+                    </w:rPr>
+                  </w:pPr>
+                  <w:r>
+                    <w:rPr>
+                      <w:sz w:val="20"/>
+                      <w:szCs w:val="20"/>
+                      <w:lang w:val="en-US"/>
+                    </w:rPr>
+                    <w:t>Agree</w:t>
+                  </w:r>
+                </w:p>
+              </w:tc>
+              <w:tc>
+                <w:tcPr>
+                  <w:tcW w:w="1163" w:type="dxa"/>
+                  <w:vAlign w:val="center"/>
+                </w:tcPr>
+                <w:p>
+                  <w:pPr>
+                    <w:rPr>
+                      <w:sz w:val="20"/>
+                      <w:szCs w:val="20"/>
+                      <w:lang w:val="en-US"/>
+                    </w:rPr>
+                  </w:pPr>
+                </w:p>
+              </w:tc>
+            </w:tr>
+          </w:tbl>
+          <w:p/>
+          <w:p>
+            <w:r>
+              <w:t xml:space="preserve">Detailed and constructive comments are provided on every part of the submission for each student. </w:t>
+            </w:r>
+            <w:r>
+              <w:t xml:space="preserve">Specifically, some improvement suggestions are </w:t>
+            </w:r>
+            <w:r>
+              <w:t xml:space="preserve">very helpful </w:t>
+            </w:r>
+            <w:r>
+              <w:t xml:space="preserve">to </w:t>
+            </w:r>
+            <w:r>
+              <w:t>students</w:t>
+            </w:r>
+            <w:r>
+              <w:t xml:space="preserve"> to prepare better for the next assignment. </w:t>
+            </w:r>
+          </w:p>
           <w:p/>
           <w:p/>
         </w:tc>
@@ -1034,7 +2267,61 @@
           <w:tcPr>
             <w:tcW w:w="6237" w:type="dxa"/>
           </w:tcPr>
-          <w:p/>
+          <w:p>
+            <w:r>
+              <w:rPr>
+                <w:noProof/>
+              </w:rPr>
+              <w:drawing>
+                <wp:inline distT="0" distB="0" distL="0" distR="0" wp14:anchorId="121DA04B" wp14:editId="159B1825">
+                  <wp:extent cx="838705" cy="396450"/>
+                  <wp:effectExtent l="0" t="0" r="0" b="3810"/>
+                  <wp:docPr id="1629677641" name="Picture 1"/>
+                  <wp:cNvGraphicFramePr>
+                    <a:graphicFrameLocks xmlns:a="http://schemas.openxmlformats.org/drawingml/2006/main" noChangeAspect="1"/>
+                  </wp:cNvGraphicFramePr>
+                  <a:graphic xmlns:a="http://schemas.openxmlformats.org/drawingml/2006/main">
+                    <a:graphicData uri="http://schemas.openxmlformats.org/drawingml/2006/picture">
+                      <pic:pic xmlns:pic="http://schemas.openxmlformats.org/drawingml/2006/picture">
+                        <pic:nvPicPr>
+                          <pic:cNvPr id="0" name="Picture 1"/>
+                          <pic:cNvPicPr>
+                            <a:picLocks noChangeAspect="1" noChangeArrowheads="1"/>
+                          </pic:cNvPicPr>
+                        </pic:nvPicPr>
+                        <pic:blipFill>
+                          <a:blip r:embed="rId7" cstate="print">
+                            <a:extLst>
+                              <a:ext uri="{28A0092B-C50C-407E-A947-70E740481C1C}">
+                                <a14:useLocalDpi xmlns:a14="http://schemas.microsoft.com/office/drawing/2010/main" val="0"/>
+                              </a:ext>
+                            </a:extLst>
+                          </a:blip>
+                          <a:srcRect/>
+                          <a:stretch>
+                            <a:fillRect/>
+                          </a:stretch>
+                        </pic:blipFill>
+                        <pic:spPr bwMode="auto">
+                          <a:xfrm>
+                            <a:off x="0" y="0"/>
+                            <a:ext cx="844658" cy="399264"/>
+                          </a:xfrm>
+                          <a:prstGeom prst="rect">
+                            <a:avLst/>
+                          </a:prstGeom>
+                          <a:noFill/>
+                          <a:ln>
+                            <a:noFill/>
+                          </a:ln>
+                        </pic:spPr>
+                      </pic:pic>
+                    </a:graphicData>
+                  </a:graphic>
+                </wp:inline>
+              </w:drawing>
+            </w:r>
+          </w:p>
         </w:tc>
       </w:tr>
     </w:tbl>
@@ -1147,6 +2434,10 @@
             <w:r>
               <w:rPr>
                 <w:rStyle w:val="CommentReference"/>
+                <w:b/>
+                <w:bCs/>
+                <w:sz w:val="24"/>
+                <w:szCs w:val="24"/>
               </w:rPr>
               <w:commentReference w:id="0"/>
             </w:r>
@@ -1163,15 +2454,7 @@
               <w:t xml:space="preserve">The module lead checked </w:t>
             </w:r>
             <w:r>
-              <w:t xml:space="preserve">carefully to ensure that solutions to the assignment could not be found </w:t>
-            </w:r>
-            <w:proofErr w:type="gramStart"/>
-            <w:r>
-              <w:t>online, and</w:t>
-            </w:r>
-            <w:proofErr w:type="gramEnd"/>
-            <w:r>
-              <w:t xml:space="preserve"> could not be solved by ChatGPT.</w:t>
+              <w:t>carefully to ensure that solutions to the assignment could not be found online, and could not be solved by ChatGPT.</w:t>
             </w:r>
           </w:p>
           <w:p/>
@@ -1337,25 +2620,7 @@
                 <w:color w:val="000000"/>
                 <w:shd w:val="clear" w:color="auto" w:fill="FFFFFF"/>
               </w:rPr>
-              <w:t xml:space="preserve">this </w:t>
-            </w:r>
-            <w:proofErr w:type="gramStart"/>
-            <w:r>
-              <w:rPr>
-                <w:rFonts w:ascii="Calibri" w:hAnsi="Calibri" w:cs="Calibri"/>
-                <w:color w:val="000000"/>
-                <w:shd w:val="clear" w:color="auto" w:fill="FFFFFF"/>
-              </w:rPr>
-              <w:t>was considered to be</w:t>
-            </w:r>
-            <w:proofErr w:type="gramEnd"/>
-            <w:r>
-              <w:rPr>
-                <w:rFonts w:ascii="Calibri" w:hAnsi="Calibri" w:cs="Calibri"/>
-                <w:color w:val="000000"/>
-                <w:shd w:val="clear" w:color="auto" w:fill="FFFFFF"/>
-              </w:rPr>
-              <w:t xml:space="preserve"> a case of poor academic practice and all students on the module were sent a non-accusatory reminder of </w:t>
+              <w:t xml:space="preserve">this was considered to be a case of poor academic practice and all students on the module were sent a non-accusatory reminder of </w:t>
             </w:r>
             <w:r>
               <w:rPr>
@@ -1379,7 +2644,7 @@
     </w:tbl>
     <w:p/>
     <w:sectPr>
-      <w:headerReference w:type="default" r:id="rId11"/>
+      <w:headerReference w:type="default" r:id="rId14"/>
       <w:pgSz w:w="11906" w:h="16838"/>
       <w:pgMar w:top="1440" w:right="1440" w:bottom="1440" w:left="1440" w:header="708" w:footer="708" w:gutter="0"/>
       <w:cols w:space="708"/>
@@ -1536,6 +2801,10 @@
     </w:pPr>
   </w:p>
 </w:hdr>
+</file>
+
+<file path=word/numbering.xml><?xml version="1.0" encoding="utf-8"?>
+<w:numbering xmlns:wpc="http://schemas.microsoft.com/office/word/2010/wordprocessingCanvas" xmlns:cx="http://schemas.microsoft.com/office/drawing/2014/chartex" xmlns:cx1="http://schemas.microsoft.com/office/drawing/2015/9/8/chartex" xmlns:cx2="http://schemas.microsoft.com/office/drawing/2015/10/21/chartex" xmlns:cx3="http://schemas.microsoft.com/office/drawing/2016/5/9/chartex" xmlns:cx4="http://schemas.microsoft.com/office/drawing/2016/5/10/chartex" xmlns:cx5="http://schemas.microsoft.com/office/drawing/2016/5/11/chartex" xmlns:cx6="http://schemas.microsoft.com/office/drawing/2016/5/12/chartex" xmlns:cx7="http://schemas.microsoft.com/office/drawing/2016/5/13/chartex" xmlns:cx8="http://schemas.microsoft.com/office/drawing/2016/5/14/chartex" xmlns:mc="http://schemas.openxmlformats.org/markup-compatibility/2006" xmlns:aink="http://schemas.microsoft.com/office/drawing/2016/ink" xmlns:am3d="http://schemas.microsoft.com/office/drawing/2017/model3d" xmlns:o="urn:schemas-microsoft-com:office:office" xmlns:oel="http://schemas.microsoft.com/office/2019/extlst" xmlns:r="http://schemas.openxmlformats.org/officeDocument/2006/relationships" xmlns:m="http://schemas.openxmlformats.org/officeDocument/2006/math" xmlns:v="urn:schemas-microsoft-com:vml" xmlns:wp14="http://schemas.microsoft.com/office/word/2010/wordprocessingDrawing" xmlns:wp="http://schemas.openxmlformats.org/drawingml/2006/wordprocessingDrawing" xmlns:w10="urn:schemas-microsoft-com:office:word" xmlns:w="http://schemas.openxmlformats.org/wordprocessingml/2006/main" xmlns:w14="http://schemas.microsoft.com/office/word/2010/wordml" xmlns:w15="http://schemas.microsoft.com/office/word/2012/wordml" xmlns:w16cex="http://schemas.microsoft.com/office/word/2018/wordml/cex" xmlns:w16cid="http://schemas.microsoft.com/office/word/2016/wordml/cid" xmlns:w16="http://schemas.microsoft.com/office/word/2018/wordml" xmlns:w16du="http://schemas.microsoft.com/office/word/2023/wordml/word16du" xmlns:w16sdtdh="http://schemas.microsoft.com/office/word/2020/wordml/sdtdatahash" xmlns:w16sdtfl="http://schemas.microsoft.com/office/word/2024/wordml/sdtformatlock" xmlns:w16se="http://schemas.microsoft.com/office/word/2015/wordml/symex" xmlns:wpg="http://schemas.microsoft.com/office/word/2010/wordprocessingGroup" xmlns:wpi="http://schemas.microsoft.com/office/word/2010/wordprocessingInk" xmlns:wne="http://schemas.microsoft.com/office/word/2006/wordml" xmlns:wps="http://schemas.microsoft.com/office/word/2010/wordprocessingShape" mc:Ignorable="w14 w15 w16se w16cid w16 w16cex w16sdtdh w16sdtfl w16du wp14"/>
 </file>
 
 <file path=word/people.xml><?xml version="1.0" encoding="utf-8"?>

</xml_diff>